<commit_message>
Resume: describe the Northline build tool generically
Co-Authored-By: Claude Opus 5.5 <noreply@anthropic.com>
</commit_message>
<xml_diff>
--- a/resume/Chinnathambi_Sundaram_Resume_ATS.docx
+++ b/resume/Chinnathambi_Sundaram_Resume_ATS.docx
@@ -117,7 +117,7 @@
         <w:spacing w:after="20"/>
       </w:pPr>
       <w:r>
-        <w:t>Directed the build with an AI coding agent (Claude Code), approving every design and deploy, with tests on every change.</w:t>
+        <w:t>Directed the build with an AI coding agent, approving every design and deploy, with tests on every change.</w:t>
       </w:r>
     </w:p>
     <w:p>
@@ -489,7 +489,7 @@
         <w:t xml:space="preserve">AI tools: </w:t>
       </w:r>
       <w:r>
-        <w:t>ChatGPT, Claude, Claude Code, Cursor, Figma AI, Figma Make, v0, Lovable, Adobe Firefly, Google Gemini, Relume, Perplexity</w:t>
+        <w:t>ChatGPT, Cursor, Figma AI, Figma Make, v0, Lovable, Adobe Firefly, Google Gemini, Relume, Perplexity</w:t>
       </w:r>
     </w:p>
     <w:p>

</xml_diff>